<commit_message>
fix(lecons): corrige l'assiette des prélèvements sociaux (revenus passifs 06)
Le corrigé de l'exercice 3c calculait les prélèvements sociaux sur le
loyer brut (5 640 × 17,2 % = 969,91 €) alors que l'impôt sur le revenu
était correctement assis sur la base après abattement de 30 %. La page
impots.gouv.fr citée en ressource n° 4 de la leçon indique que ces taux
s'appliquent au revenu net, après abattement ou charges selon le régime :
l'assiette est commune.

Prélèvements sociaux : 679,06 € au lieu de 969,91 €. Total fiscal :
1 113,34 € au lieu de 1 404,19 €. Rentabilité nette réelle : 2,66 % au
lieu de 2,40 %. Une note de méthode rend l'assiette commune explicite.

La démonstration de l'exercice n'est pas affectée — le glissement du
brut affiché au net perçu reste son enseignement.

Formulation d'origine conservée dans le journal des corrections.

Co-Authored-By: Claude Opus 5 <noreply@anthropic.com>
</commit_message>
<xml_diff>
--- a/livrables/lecons/2026-08-30_lecon-revenus-passifs_06_placements-etf-dividendes-scpi.docx
+++ b/livrables/lecons/2026-08-30_lecon-revenus-passifs_06_placements-etf-dividendes-scpi.docx
@@ -3077,18 +3077,18 @@
           <w:sz w:val="22"/>
           <w:szCs w:val="22"/>
         </w:rPr>
-        <w:t xml:space="preserve"> Base imposable IR = 5 640 × 70 % = 3 948 €  |  IR = 3 948 × 11 % = 434,28 €  |  PS = 5 640 × 17,2 % = 969,91 €  |  Total fiscal = 1 404,19 €  |  Revenu net = 4 040 − 1 404,19 = 2 635,81 €  |  Rentabilité nette réelle = 2 635,81 / 110 000 = </w:t>
-      </w:r>
-      <w:r>
-        <w:rPr>
-          <w:rFonts w:ascii="Times New Roman" w:cs="Times New Roman" w:eastAsia="Times New Roman" w:hAnsi="Times New Roman"/>
-          <w:b/>
-          <w:bCs/>
-          <w:color w:val="1F2937"/>
-          <w:sz w:val="22"/>
-          <w:szCs w:val="22"/>
-        </w:rPr>
-        <w:t xml:space="preserve">2,40 %</w:t>
+        <w:t xml:space="preserve"> ⚠️ Point de méthode : en micro-foncier, l'abattement de 30 % détermine la base imposable pour l'IMPÔT SUR LE REVENU **ET** pour les PRÉLÈVEMENTS SOCIAUX — la page impots.gouv.fr citée en ressources précise que ces taux s'appliquent au revenu net, après abattement forfaitaire ou charges réelles selon le régime. Les deux se calculent donc sur la même assiette. Base imposable = 5 640 × 70 % = 3 948 €  |  IR = 3 948 × 11 % = 434,28 €  |  PS = 3 948 × 17,2 % = 679,06 €  |  Total fiscal = 1 113,34 €  |  Revenu net = 4 040 − 1 113,34 = 2 926,66 €  |  Rentabilité nette réelle = 2 926,66 / 110 000 = </w:t>
+      </w:r>
+      <w:r>
+        <w:rPr>
+          <w:rFonts w:ascii="Times New Roman" w:cs="Times New Roman" w:eastAsia="Times New Roman" w:hAnsi="Times New Roman"/>
+          <w:b/>
+          <w:bCs/>
+          <w:color w:val="1F2937"/>
+          <w:sz w:val="22"/>
+          <w:szCs w:val="22"/>
+        </w:rPr>
+        <w:t xml:space="preserve">2,66 %</w:t>
       </w:r>
     </w:p>
     <w:p>
@@ -3115,7 +3115,7 @@
           <w:sz w:val="22"/>
           <w:szCs w:val="22"/>
         </w:rPr>
-        <w:t xml:space="preserve">Le glissement de 5,13 % (brut) à 2,40 % (net réel) illustre concrètement pourquoi la rentabilité brute affichée dans les annonces ne reflète pas le revenu effectivement perçu. Cette simulation ne tient pas compte d'une éventuelle vacance locative (1 mois vide par an ferait baisser le revenu de ~470 €) ni des travaux de remise en état entre locataires.</w:t>
+        <w:t xml:space="preserve">Le glissement de 5,13 % (brut) à 2,66 % (net réel) illustre concrètement pourquoi la rentabilité brute affichée dans les annonces ne reflète pas le revenu effectivement perçu. Cette simulation ne tient pas compte d'une éventuelle vacance locative (1 mois vide par an ferait baisser le revenu de ~470 €) ni des travaux de remise en état entre locataires.</w:t>
       </w:r>
     </w:p>
     <w:p>
@@ -4236,6 +4236,78 @@
           <w:szCs w:val="18"/>
         </w:rPr>
         <w:t xml:space="preserve">Document éducatif exclusivement. Ne constitue pas un conseil en investissement au sens de la réglementation française (CIF, ORIAS). Toute décision financière engage votre seule responsabilité.</w:t>
+      </w:r>
+    </w:p>
+    <w:p>
+      <w:pPr>
+        <w:spacing w:after="120" w:before="300"/>
+      </w:pPr>
+      <w:r>
+        <w:rPr>
+          <w:rFonts w:ascii="Times New Roman" w:cs="Times New Roman" w:eastAsia="Times New Roman" w:hAnsi="Times New Roman"/>
+          <w:b/>
+          <w:bCs/>
+          <w:color w:val="1B3A6B"/>
+          <w:sz w:val="28"/>
+          <w:szCs w:val="28"/>
+        </w:rPr>
+        <w:t xml:space="preserve">📝 Journal des corrections</w:t>
+      </w:r>
+    </w:p>
+    <w:p>
+      <w:pPr>
+        <w:spacing w:after="80" w:before="80"/>
+      </w:pPr>
+      <w:r>
+        <w:rPr>
+          <w:rFonts w:ascii="Times New Roman" w:cs="Times New Roman" w:eastAsia="Times New Roman" w:hAnsi="Times New Roman"/>
+          <w:color w:val="1F2937"/>
+          <w:sz w:val="22"/>
+          <w:szCs w:val="22"/>
+        </w:rPr>
+        <w:t xml:space="preserve">Leçon produite et relue le 30/08/2026. La correction est fondue dans le texte ci-dessus ; la formulation d'origine est conservée ici.</w:t>
+      </w:r>
+    </w:p>
+    <w:p>
+      <w:pPr>
+        <w:spacing w:after="80" w:before="80"/>
+      </w:pPr>
+      <w:r>
+        <w:rPr>
+          <w:rFonts w:ascii="Times New Roman" w:cs="Times New Roman" w:eastAsia="Times New Roman" w:hAnsi="Times New Roman"/>
+          <w:color w:val="1F2937"/>
+          <w:sz w:val="22"/>
+          <w:szCs w:val="22"/>
+        </w:rPr>
+        <w:t xml:space="preserve">1. Exercice 3c — assiette des prélèvements sociaux en micro-foncier.</w:t>
+      </w:r>
+    </w:p>
+    <w:p>
+      <w:pPr>
+        <w:spacing w:after="80" w:before="80"/>
+      </w:pPr>
+      <w:r>
+        <w:rPr>
+          <w:rFonts w:ascii="Times New Roman" w:cs="Times New Roman" w:eastAsia="Times New Roman" w:hAnsi="Times New Roman"/>
+          <w:color w:val="1F2937"/>
+          <w:sz w:val="22"/>
+          <w:szCs w:val="22"/>
+        </w:rPr>
+        <w:t xml:space="preserve">Version initiale : « Base imposable IR = 5 640 × 70 % = 3 948 € | IR = 3 948 × 11 % = 434,28 € | PS = 5 640 × 17,2 % = 969,91 € | Total fiscal = 1 404,19 € | Revenu net = 4 040 − 1 404,19 = 2 635,81 € | Rentabilité nette réelle = 2,40 % ». L'impôt sur le revenu était bien assis sur la base après abattement, mais les prélèvements sociaux étaient calculés sur le LOYER BRUT. Or la page impots.gouv.fr citée en ressource n° 4 de cette même leçon indique que ces taux s'appliquent au revenu net, après abattement forfaitaire ou charges réelles selon le régime : l'assiette est la même pour l'IR et pour les prélèvements sociaux. Vérifié le 30/08/2026. Les prélèvements sociaux passent donc de 969,91 € à 679,06 €, le total fiscal de 1 404,19 € à 1 113,34 €, et la rentabilité nette réelle de 2,40 % à 2,66 %. La démonstration de l'exercice n'est pas affectée — le glissement de la rentabilité brute affichée au revenu réellement perçu reste son enseignement — mais elle surestimait la ponction fiscale de près de 300 €. Une note de méthode a été ajoutée au corrigé pour que l'assiette commune soit explicite.</w:t>
+      </w:r>
+    </w:p>
+    <w:p>
+      <w:pPr>
+        <w:spacing w:after="80" w:before="80"/>
+      </w:pPr>
+      <w:r>
+        <w:rPr>
+          <w:rFonts w:ascii="Times New Roman" w:cs="Times New Roman" w:eastAsia="Times New Roman" w:hAnsi="Times New Roman"/>
+          <w:color w:val="1F2937"/>
+          <w:sz w:val="22"/>
+          <w:szCs w:val="22"/>
+        </w:rPr>
+        <w:t xml:space="preserve">Vérifié lors de la relecture et inchangé : la distinction 17,2 % (location nue : CSG 9,2 + CRDS 0,5 + solidarité 7,5) contre 18,6 % (location meublée : CSG 10,6), contrôlée le 30/08/2026 sur la page impots.gouv.fr citée — c'est un point que beaucoup de sources confondent, et la leçon le traite correctement ; le PFU à 31,4 % et l'arbitrage avec le barème progressif, dont le seuil de bascule calculé (60 % × 30 % + 18,6 % = 36,6 % &gt; 31,4 %) est exact ; l'exercice 1 dans son intégralité (823,20 € nets au PFU, 897,60 € au barème à 11 %) ; les rentabilités brute (5,13 %) et nette de charges (3,67 %) de l'exercice 3 ; et l'ensemble des chiffres ASPIM 2024 — taux de distribution 4,72 %, performance globale −1,1 %, bureaux −5,1 %, valeur de réalisation −5,8 %, taux d'occupation financier 92,2 %.</w:t>
       </w:r>
     </w:p>
     <w:sectPr>

</xml_diff>